<commit_message>
Ultima modificación del archivo word
</commit_message>
<xml_diff>
--- a/docs/Tangarife_Manuela_EA1.docx
+++ b/docs/Tangarife_Manuela_EA1.docx
@@ -99,34 +99,7 @@
           <w:sz w:val="22"/>
           <w:lang w:val="es-CO"/>
         </w:rPr>
-        <w:t>PRE</w:t>
-      </w:r>
-      <w:r>
-        <w:rPr>
-          <w:rFonts w:ascii="Arial" w:hAnsi="Arial" w:cs="Arial"/>
-          <w:color w:val="000000" w:themeColor="text1"/>
-          <w:sz w:val="22"/>
-          <w:lang w:val="es-CO"/>
-        </w:rPr>
-        <w:t>ICA2602B020053</w:t>
-      </w:r>
-      <w:r>
-        <w:rPr>
-          <w:rFonts w:ascii="Arial" w:hAnsi="Arial" w:cs="Arial"/>
-          <w:color w:val="000000" w:themeColor="text1"/>
-          <w:sz w:val="22"/>
-          <w:lang w:val="es-CO"/>
-        </w:rPr>
-        <w:t xml:space="preserve"> –</w:t>
-      </w:r>
-      <w:r>
-        <w:rPr>
-          <w:rFonts w:ascii="Arial" w:hAnsi="Arial" w:cs="Arial"/>
-          <w:color w:val="000000" w:themeColor="text1"/>
-          <w:sz w:val="22"/>
-          <w:lang w:val="es-CO"/>
-        </w:rPr>
-        <w:t xml:space="preserve"> Ingeniería de Software</w:t>
+        <w:t>PREICA2602B020053 – Ingeniería de Software</w:t>
       </w:r>
     </w:p>
     <w:p>
@@ -179,16 +152,7 @@
           <w:sz w:val="22"/>
           <w:lang w:val="es-CO"/>
         </w:rPr>
-        <w:t>Octubre</w:t>
-      </w:r>
-      <w:r>
-        <w:rPr>
-          <w:rFonts w:ascii="Arial" w:hAnsi="Arial" w:cs="Arial"/>
-          <w:color w:val="000000" w:themeColor="text1"/>
-          <w:sz w:val="22"/>
-          <w:lang w:val="es-CO"/>
-        </w:rPr>
-        <w:t xml:space="preserve"> de 2026</w:t>
+        <w:t>Octubre de 2026</w:t>
       </w:r>
     </w:p>
     <w:p>
@@ -326,7 +290,11 @@
     <w:sdt>
       <w:sdtPr>
         <w:rPr>
-          <w:lang w:val="es-ES"/>
+          <w:rFonts w:ascii="Times New Roman" w:eastAsiaTheme="minorEastAsia" w:hAnsi="Times New Roman" w:cstheme="minorBidi"/>
+          <w:color w:val="auto"/>
+          <w:sz w:val="24"/>
+          <w:szCs w:val="22"/>
+          <w:lang w:val="es-ES" w:eastAsia="en-US"/>
         </w:rPr>
         <w:id w:val="59758679"/>
         <w:docPartObj>
@@ -336,13 +304,8 @@
       </w:sdtPr>
       <w:sdtEndPr>
         <w:rPr>
-          <w:rFonts w:ascii="Times New Roman" w:eastAsiaTheme="minorEastAsia" w:hAnsi="Times New Roman" w:cstheme="minorBidi"/>
           <w:b/>
           <w:bCs/>
-          <w:color w:val="auto"/>
-          <w:sz w:val="24"/>
-          <w:szCs w:val="22"/>
-          <w:lang w:eastAsia="en-US"/>
         </w:rPr>
       </w:sdtEndPr>
       <w:sdtContent>
@@ -371,12 +334,39 @@
               <w:szCs w:val="22"/>
               <w:lang w:val="es-ES"/>
             </w:rPr>
-            <w:t>Tabla de contenido</w:t>
+            <w:t xml:space="preserve">Tabla de </w:t>
+          </w:r>
+          <w:r>
+            <w:rPr>
+              <w:rFonts w:ascii="Arial" w:hAnsi="Arial" w:cs="Arial"/>
+              <w:b/>
+              <w:bCs/>
+              <w:color w:val="000000" w:themeColor="text1"/>
+              <w:sz w:val="22"/>
+              <w:szCs w:val="22"/>
+              <w:lang w:val="es-ES"/>
+            </w:rPr>
+            <w:t>C</w:t>
+          </w:r>
+          <w:r>
+            <w:rPr>
+              <w:rFonts w:ascii="Arial" w:hAnsi="Arial" w:cs="Arial"/>
+              <w:b/>
+              <w:bCs/>
+              <w:color w:val="000000" w:themeColor="text1"/>
+              <w:sz w:val="22"/>
+              <w:szCs w:val="22"/>
+              <w:lang w:val="es-ES"/>
+            </w:rPr>
+            <w:t>ontenido</w:t>
           </w:r>
         </w:p>
         <w:p>
           <w:pPr>
+            <w:spacing w:line="480" w:lineRule="auto"/>
             <w:rPr>
+              <w:rFonts w:ascii="Arial" w:hAnsi="Arial" w:cs="Arial"/>
+              <w:sz w:val="22"/>
               <w:lang w:val="es-ES" w:eastAsia="es-CO"/>
             </w:rPr>
           </w:pPr>
@@ -391,8 +381,10 @@
             <w:rPr>
               <w:rFonts w:ascii="Arial" w:hAnsi="Arial" w:cs="Arial"/>
               <w:noProof/>
-              <w:color w:val="000000" w:themeColor="text1"/>
+              <w:kern w:val="2"/>
               <w:sz w:val="22"/>
+              <w:lang w:val="es-CO" w:eastAsia="es-CO"/>
+              <w14:ligatures w14:val="standardContextual"/>
             </w:rPr>
           </w:pPr>
           <w:r>
@@ -419,13 +411,12 @@
             </w:rPr>
             <w:fldChar w:fldCharType="separate"/>
           </w:r>
-          <w:hyperlink w:anchor="_Toc243748269" w:history="1">
+          <w:hyperlink w:anchor="_Toc243749643" w:history="1">
             <w:r>
               <w:rPr>
                 <w:rStyle w:val="Hipervnculo"/>
                 <w:rFonts w:ascii="Arial" w:hAnsi="Arial" w:cs="Arial"/>
                 <w:noProof/>
-                <w:color w:val="000000" w:themeColor="text1"/>
                 <w:sz w:val="22"/>
               </w:rPr>
               <w:t>Introducción</w:t>
@@ -435,7 +426,6 @@
                 <w:rFonts w:ascii="Arial" w:hAnsi="Arial" w:cs="Arial"/>
                 <w:noProof/>
                 <w:webHidden/>
-                <w:color w:val="000000" w:themeColor="text1"/>
                 <w:sz w:val="22"/>
               </w:rPr>
               <w:tab/>
@@ -445,7 +435,6 @@
                 <w:rFonts w:ascii="Arial" w:hAnsi="Arial" w:cs="Arial"/>
                 <w:noProof/>
                 <w:webHidden/>
-                <w:color w:val="000000" w:themeColor="text1"/>
                 <w:sz w:val="22"/>
               </w:rPr>
               <w:fldChar w:fldCharType="begin"/>
@@ -455,26 +444,23 @@
                 <w:rFonts w:ascii="Arial" w:hAnsi="Arial" w:cs="Arial"/>
                 <w:noProof/>
                 <w:webHidden/>
-                <w:color w:val="000000" w:themeColor="text1"/>
-                <w:sz w:val="22"/>
-              </w:rPr>
-              <w:instrText xml:space="preserve"> PAGEREF _Toc243748269 \h </w:instrText>
-            </w:r>
-            <w:r>
-              <w:rPr>
-                <w:rFonts w:ascii="Arial" w:hAnsi="Arial" w:cs="Arial"/>
-                <w:noProof/>
-                <w:webHidden/>
-                <w:color w:val="000000" w:themeColor="text1"/>
-                <w:sz w:val="22"/>
-              </w:rPr>
-            </w:r>
-            <w:r>
-              <w:rPr>
-                <w:rFonts w:ascii="Arial" w:hAnsi="Arial" w:cs="Arial"/>
-                <w:noProof/>
-                <w:webHidden/>
-                <w:color w:val="000000" w:themeColor="text1"/>
+                <w:sz w:val="22"/>
+              </w:rPr>
+              <w:instrText xml:space="preserve"> PAGEREF _Toc243749643 \h </w:instrText>
+            </w:r>
+            <w:r>
+              <w:rPr>
+                <w:rFonts w:ascii="Arial" w:hAnsi="Arial" w:cs="Arial"/>
+                <w:noProof/>
+                <w:webHidden/>
+                <w:sz w:val="22"/>
+              </w:rPr>
+            </w:r>
+            <w:r>
+              <w:rPr>
+                <w:rFonts w:ascii="Arial" w:hAnsi="Arial" w:cs="Arial"/>
+                <w:noProof/>
+                <w:webHidden/>
                 <w:sz w:val="22"/>
               </w:rPr>
               <w:fldChar w:fldCharType="separate"/>
@@ -484,7 +470,6 @@
                 <w:rFonts w:ascii="Arial" w:hAnsi="Arial" w:cs="Arial"/>
                 <w:noProof/>
                 <w:webHidden/>
-                <w:color w:val="000000" w:themeColor="text1"/>
                 <w:sz w:val="22"/>
               </w:rPr>
               <w:t>2</w:t>
@@ -494,7 +479,6 @@
                 <w:rFonts w:ascii="Arial" w:hAnsi="Arial" w:cs="Arial"/>
                 <w:noProof/>
                 <w:webHidden/>
-                <w:color w:val="000000" w:themeColor="text1"/>
                 <w:sz w:val="22"/>
               </w:rPr>
               <w:fldChar w:fldCharType="end"/>
@@ -511,17 +495,18 @@
             <w:rPr>
               <w:rFonts w:ascii="Arial" w:hAnsi="Arial" w:cs="Arial"/>
               <w:noProof/>
-              <w:color w:val="000000" w:themeColor="text1"/>
+              <w:kern w:val="2"/>
               <w:sz w:val="22"/>
+              <w:lang w:val="es-CO" w:eastAsia="es-CO"/>
+              <w14:ligatures w14:val="standardContextual"/>
             </w:rPr>
           </w:pPr>
-          <w:hyperlink w:anchor="_Toc243748270" w:history="1">
+          <w:hyperlink w:anchor="_Toc243749644" w:history="1">
             <w:r>
               <w:rPr>
                 <w:rStyle w:val="Hipervnculo"/>
                 <w:rFonts w:ascii="Arial" w:hAnsi="Arial" w:cs="Arial"/>
                 <w:noProof/>
-                <w:color w:val="000000" w:themeColor="text1"/>
                 <w:sz w:val="22"/>
               </w:rPr>
               <w:t>Funcionalidades</w:t>
@@ -531,7 +516,6 @@
                 <w:rFonts w:ascii="Arial" w:hAnsi="Arial" w:cs="Arial"/>
                 <w:noProof/>
                 <w:webHidden/>
-                <w:color w:val="000000" w:themeColor="text1"/>
                 <w:sz w:val="22"/>
               </w:rPr>
               <w:tab/>
@@ -541,7 +525,6 @@
                 <w:rFonts w:ascii="Arial" w:hAnsi="Arial" w:cs="Arial"/>
                 <w:noProof/>
                 <w:webHidden/>
-                <w:color w:val="000000" w:themeColor="text1"/>
                 <w:sz w:val="22"/>
               </w:rPr>
               <w:fldChar w:fldCharType="begin"/>
@@ -551,26 +534,23 @@
                 <w:rFonts w:ascii="Arial" w:hAnsi="Arial" w:cs="Arial"/>
                 <w:noProof/>
                 <w:webHidden/>
-                <w:color w:val="000000" w:themeColor="text1"/>
-                <w:sz w:val="22"/>
-              </w:rPr>
-              <w:instrText xml:space="preserve"> PAGEREF _Toc243748270 \h </w:instrText>
-            </w:r>
-            <w:r>
-              <w:rPr>
-                <w:rFonts w:ascii="Arial" w:hAnsi="Arial" w:cs="Arial"/>
-                <w:noProof/>
-                <w:webHidden/>
-                <w:color w:val="000000" w:themeColor="text1"/>
-                <w:sz w:val="22"/>
-              </w:rPr>
-            </w:r>
-            <w:r>
-              <w:rPr>
-                <w:rFonts w:ascii="Arial" w:hAnsi="Arial" w:cs="Arial"/>
-                <w:noProof/>
-                <w:webHidden/>
-                <w:color w:val="000000" w:themeColor="text1"/>
+                <w:sz w:val="22"/>
+              </w:rPr>
+              <w:instrText xml:space="preserve"> PAGEREF _Toc243749644 \h </w:instrText>
+            </w:r>
+            <w:r>
+              <w:rPr>
+                <w:rFonts w:ascii="Arial" w:hAnsi="Arial" w:cs="Arial"/>
+                <w:noProof/>
+                <w:webHidden/>
+                <w:sz w:val="22"/>
+              </w:rPr>
+            </w:r>
+            <w:r>
+              <w:rPr>
+                <w:rFonts w:ascii="Arial" w:hAnsi="Arial" w:cs="Arial"/>
+                <w:noProof/>
+                <w:webHidden/>
                 <w:sz w:val="22"/>
               </w:rPr>
               <w:fldChar w:fldCharType="separate"/>
@@ -580,7 +560,6 @@
                 <w:rFonts w:ascii="Arial" w:hAnsi="Arial" w:cs="Arial"/>
                 <w:noProof/>
                 <w:webHidden/>
-                <w:color w:val="000000" w:themeColor="text1"/>
                 <w:sz w:val="22"/>
               </w:rPr>
               <w:t>3</w:t>
@@ -590,7 +569,6 @@
                 <w:rFonts w:ascii="Arial" w:hAnsi="Arial" w:cs="Arial"/>
                 <w:noProof/>
                 <w:webHidden/>
-                <w:color w:val="000000" w:themeColor="text1"/>
                 <w:sz w:val="22"/>
               </w:rPr>
               <w:fldChar w:fldCharType="end"/>
@@ -607,27 +585,27 @@
             <w:rPr>
               <w:rFonts w:ascii="Arial" w:hAnsi="Arial" w:cs="Arial"/>
               <w:noProof/>
-              <w:color w:val="000000" w:themeColor="text1"/>
+              <w:kern w:val="2"/>
               <w:sz w:val="22"/>
+              <w:lang w:val="es-CO" w:eastAsia="es-CO"/>
+              <w14:ligatures w14:val="standardContextual"/>
             </w:rPr>
           </w:pPr>
-          <w:hyperlink w:anchor="_Toc243748271" w:history="1">
+          <w:hyperlink w:anchor="_Toc243749645" w:history="1">
             <w:r>
               <w:rPr>
                 <w:rStyle w:val="Hipervnculo"/>
                 <w:rFonts w:ascii="Arial" w:hAnsi="Arial" w:cs="Arial"/>
                 <w:noProof/>
-                <w:color w:val="000000" w:themeColor="text1"/>
-                <w:sz w:val="22"/>
-              </w:rPr>
-              <w:t>Tecnologías utilizadas</w:t>
-            </w:r>
-            <w:r>
-              <w:rPr>
-                <w:rFonts w:ascii="Arial" w:hAnsi="Arial" w:cs="Arial"/>
-                <w:noProof/>
-                <w:webHidden/>
-                <w:color w:val="000000" w:themeColor="text1"/>
+                <w:sz w:val="22"/>
+              </w:rPr>
+              <w:t>Tecnologías Utilizadas</w:t>
+            </w:r>
+            <w:r>
+              <w:rPr>
+                <w:rFonts w:ascii="Arial" w:hAnsi="Arial" w:cs="Arial"/>
+                <w:noProof/>
+                <w:webHidden/>
                 <w:sz w:val="22"/>
               </w:rPr>
               <w:tab/>
@@ -637,7 +615,6 @@
                 <w:rFonts w:ascii="Arial" w:hAnsi="Arial" w:cs="Arial"/>
                 <w:noProof/>
                 <w:webHidden/>
-                <w:color w:val="000000" w:themeColor="text1"/>
                 <w:sz w:val="22"/>
               </w:rPr>
               <w:fldChar w:fldCharType="begin"/>
@@ -647,26 +624,23 @@
                 <w:rFonts w:ascii="Arial" w:hAnsi="Arial" w:cs="Arial"/>
                 <w:noProof/>
                 <w:webHidden/>
-                <w:color w:val="000000" w:themeColor="text1"/>
-                <w:sz w:val="22"/>
-              </w:rPr>
-              <w:instrText xml:space="preserve"> PAGEREF _Toc243748271 \h </w:instrText>
-            </w:r>
-            <w:r>
-              <w:rPr>
-                <w:rFonts w:ascii="Arial" w:hAnsi="Arial" w:cs="Arial"/>
-                <w:noProof/>
-                <w:webHidden/>
-                <w:color w:val="000000" w:themeColor="text1"/>
-                <w:sz w:val="22"/>
-              </w:rPr>
-            </w:r>
-            <w:r>
-              <w:rPr>
-                <w:rFonts w:ascii="Arial" w:hAnsi="Arial" w:cs="Arial"/>
-                <w:noProof/>
-                <w:webHidden/>
-                <w:color w:val="000000" w:themeColor="text1"/>
+                <w:sz w:val="22"/>
+              </w:rPr>
+              <w:instrText xml:space="preserve"> PAGEREF _Toc243749645 \h </w:instrText>
+            </w:r>
+            <w:r>
+              <w:rPr>
+                <w:rFonts w:ascii="Arial" w:hAnsi="Arial" w:cs="Arial"/>
+                <w:noProof/>
+                <w:webHidden/>
+                <w:sz w:val="22"/>
+              </w:rPr>
+            </w:r>
+            <w:r>
+              <w:rPr>
+                <w:rFonts w:ascii="Arial" w:hAnsi="Arial" w:cs="Arial"/>
+                <w:noProof/>
+                <w:webHidden/>
                 <w:sz w:val="22"/>
               </w:rPr>
               <w:fldChar w:fldCharType="separate"/>
@@ -676,7 +650,6 @@
                 <w:rFonts w:ascii="Arial" w:hAnsi="Arial" w:cs="Arial"/>
                 <w:noProof/>
                 <w:webHidden/>
-                <w:color w:val="000000" w:themeColor="text1"/>
                 <w:sz w:val="22"/>
               </w:rPr>
               <w:t>3</w:t>
@@ -686,7 +659,6 @@
                 <w:rFonts w:ascii="Arial" w:hAnsi="Arial" w:cs="Arial"/>
                 <w:noProof/>
                 <w:webHidden/>
-                <w:color w:val="000000" w:themeColor="text1"/>
                 <w:sz w:val="22"/>
               </w:rPr>
               <w:fldChar w:fldCharType="end"/>
@@ -703,17 +675,18 @@
             <w:rPr>
               <w:rFonts w:ascii="Arial" w:hAnsi="Arial" w:cs="Arial"/>
               <w:noProof/>
-              <w:color w:val="000000" w:themeColor="text1"/>
+              <w:kern w:val="2"/>
               <w:sz w:val="22"/>
+              <w:lang w:val="es-CO" w:eastAsia="es-CO"/>
+              <w14:ligatures w14:val="standardContextual"/>
             </w:rPr>
           </w:pPr>
-          <w:hyperlink w:anchor="_Toc243748272" w:history="1">
+          <w:hyperlink w:anchor="_Toc243749646" w:history="1">
             <w:r>
               <w:rPr>
                 <w:rStyle w:val="Hipervnculo"/>
                 <w:rFonts w:ascii="Arial" w:hAnsi="Arial" w:cs="Arial"/>
                 <w:noProof/>
-                <w:color w:val="000000" w:themeColor="text1"/>
                 <w:sz w:val="22"/>
               </w:rPr>
               <w:t>Diseño de la Base de Datos</w:t>
@@ -723,7 +696,6 @@
                 <w:rFonts w:ascii="Arial" w:hAnsi="Arial" w:cs="Arial"/>
                 <w:noProof/>
                 <w:webHidden/>
-                <w:color w:val="000000" w:themeColor="text1"/>
                 <w:sz w:val="22"/>
               </w:rPr>
               <w:tab/>
@@ -733,7 +705,6 @@
                 <w:rFonts w:ascii="Arial" w:hAnsi="Arial" w:cs="Arial"/>
                 <w:noProof/>
                 <w:webHidden/>
-                <w:color w:val="000000" w:themeColor="text1"/>
                 <w:sz w:val="22"/>
               </w:rPr>
               <w:fldChar w:fldCharType="begin"/>
@@ -743,26 +714,23 @@
                 <w:rFonts w:ascii="Arial" w:hAnsi="Arial" w:cs="Arial"/>
                 <w:noProof/>
                 <w:webHidden/>
-                <w:color w:val="000000" w:themeColor="text1"/>
-                <w:sz w:val="22"/>
-              </w:rPr>
-              <w:instrText xml:space="preserve"> PAGEREF _Toc243748272 \h </w:instrText>
-            </w:r>
-            <w:r>
-              <w:rPr>
-                <w:rFonts w:ascii="Arial" w:hAnsi="Arial" w:cs="Arial"/>
-                <w:noProof/>
-                <w:webHidden/>
-                <w:color w:val="000000" w:themeColor="text1"/>
-                <w:sz w:val="22"/>
-              </w:rPr>
-            </w:r>
-            <w:r>
-              <w:rPr>
-                <w:rFonts w:ascii="Arial" w:hAnsi="Arial" w:cs="Arial"/>
-                <w:noProof/>
-                <w:webHidden/>
-                <w:color w:val="000000" w:themeColor="text1"/>
+                <w:sz w:val="22"/>
+              </w:rPr>
+              <w:instrText xml:space="preserve"> PAGEREF _Toc243749646 \h </w:instrText>
+            </w:r>
+            <w:r>
+              <w:rPr>
+                <w:rFonts w:ascii="Arial" w:hAnsi="Arial" w:cs="Arial"/>
+                <w:noProof/>
+                <w:webHidden/>
+                <w:sz w:val="22"/>
+              </w:rPr>
+            </w:r>
+            <w:r>
+              <w:rPr>
+                <w:rFonts w:ascii="Arial" w:hAnsi="Arial" w:cs="Arial"/>
+                <w:noProof/>
+                <w:webHidden/>
                 <w:sz w:val="22"/>
               </w:rPr>
               <w:fldChar w:fldCharType="separate"/>
@@ -772,7 +740,6 @@
                 <w:rFonts w:ascii="Arial" w:hAnsi="Arial" w:cs="Arial"/>
                 <w:noProof/>
                 <w:webHidden/>
-                <w:color w:val="000000" w:themeColor="text1"/>
                 <w:sz w:val="22"/>
               </w:rPr>
               <w:t>4</w:t>
@@ -782,7 +749,6 @@
                 <w:rFonts w:ascii="Arial" w:hAnsi="Arial" w:cs="Arial"/>
                 <w:noProof/>
                 <w:webHidden/>
-                <w:color w:val="000000" w:themeColor="text1"/>
                 <w:sz w:val="22"/>
               </w:rPr>
               <w:fldChar w:fldCharType="end"/>
@@ -799,17 +765,18 @@
             <w:rPr>
               <w:rFonts w:ascii="Arial" w:hAnsi="Arial" w:cs="Arial"/>
               <w:noProof/>
-              <w:color w:val="000000" w:themeColor="text1"/>
+              <w:kern w:val="2"/>
               <w:sz w:val="22"/>
+              <w:lang w:val="es-CO" w:eastAsia="es-CO"/>
+              <w14:ligatures w14:val="standardContextual"/>
             </w:rPr>
           </w:pPr>
-          <w:hyperlink w:anchor="_Toc243748273" w:history="1">
+          <w:hyperlink w:anchor="_Toc243749647" w:history="1">
             <w:r>
               <w:rPr>
                 <w:rStyle w:val="Hipervnculo"/>
                 <w:rFonts w:ascii="Arial" w:hAnsi="Arial" w:cs="Arial"/>
                 <w:noProof/>
-                <w:color w:val="000000" w:themeColor="text1"/>
                 <w:sz w:val="22"/>
               </w:rPr>
               <w:t>Organización del Proyecto</w:t>
@@ -819,7 +786,6 @@
                 <w:rFonts w:ascii="Arial" w:hAnsi="Arial" w:cs="Arial"/>
                 <w:noProof/>
                 <w:webHidden/>
-                <w:color w:val="000000" w:themeColor="text1"/>
                 <w:sz w:val="22"/>
               </w:rPr>
               <w:tab/>
@@ -829,7 +795,6 @@
                 <w:rFonts w:ascii="Arial" w:hAnsi="Arial" w:cs="Arial"/>
                 <w:noProof/>
                 <w:webHidden/>
-                <w:color w:val="000000" w:themeColor="text1"/>
                 <w:sz w:val="22"/>
               </w:rPr>
               <w:fldChar w:fldCharType="begin"/>
@@ -839,26 +804,23 @@
                 <w:rFonts w:ascii="Arial" w:hAnsi="Arial" w:cs="Arial"/>
                 <w:noProof/>
                 <w:webHidden/>
-                <w:color w:val="000000" w:themeColor="text1"/>
-                <w:sz w:val="22"/>
-              </w:rPr>
-              <w:instrText xml:space="preserve"> PAGEREF _Toc243748273 \h </w:instrText>
-            </w:r>
-            <w:r>
-              <w:rPr>
-                <w:rFonts w:ascii="Arial" w:hAnsi="Arial" w:cs="Arial"/>
-                <w:noProof/>
-                <w:webHidden/>
-                <w:color w:val="000000" w:themeColor="text1"/>
-                <w:sz w:val="22"/>
-              </w:rPr>
-            </w:r>
-            <w:r>
-              <w:rPr>
-                <w:rFonts w:ascii="Arial" w:hAnsi="Arial" w:cs="Arial"/>
-                <w:noProof/>
-                <w:webHidden/>
-                <w:color w:val="000000" w:themeColor="text1"/>
+                <w:sz w:val="22"/>
+              </w:rPr>
+              <w:instrText xml:space="preserve"> PAGEREF _Toc243749647 \h </w:instrText>
+            </w:r>
+            <w:r>
+              <w:rPr>
+                <w:rFonts w:ascii="Arial" w:hAnsi="Arial" w:cs="Arial"/>
+                <w:noProof/>
+                <w:webHidden/>
+                <w:sz w:val="22"/>
+              </w:rPr>
+            </w:r>
+            <w:r>
+              <w:rPr>
+                <w:rFonts w:ascii="Arial" w:hAnsi="Arial" w:cs="Arial"/>
+                <w:noProof/>
+                <w:webHidden/>
                 <w:sz w:val="22"/>
               </w:rPr>
               <w:fldChar w:fldCharType="separate"/>
@@ -868,17 +830,15 @@
                 <w:rFonts w:ascii="Arial" w:hAnsi="Arial" w:cs="Arial"/>
                 <w:noProof/>
                 <w:webHidden/>
-                <w:color w:val="000000" w:themeColor="text1"/>
-                <w:sz w:val="22"/>
-              </w:rPr>
-              <w:t>4</w:t>
-            </w:r>
-            <w:r>
-              <w:rPr>
-                <w:rFonts w:ascii="Arial" w:hAnsi="Arial" w:cs="Arial"/>
-                <w:noProof/>
-                <w:webHidden/>
-                <w:color w:val="000000" w:themeColor="text1"/>
+                <w:sz w:val="22"/>
+              </w:rPr>
+              <w:t>5</w:t>
+            </w:r>
+            <w:r>
+              <w:rPr>
+                <w:rFonts w:ascii="Arial" w:hAnsi="Arial" w:cs="Arial"/>
+                <w:noProof/>
+                <w:webHidden/>
                 <w:sz w:val="22"/>
               </w:rPr>
               <w:fldChar w:fldCharType="end"/>
@@ -895,17 +855,18 @@
             <w:rPr>
               <w:rFonts w:ascii="Arial" w:hAnsi="Arial" w:cs="Arial"/>
               <w:noProof/>
-              <w:color w:val="000000" w:themeColor="text1"/>
+              <w:kern w:val="2"/>
               <w:sz w:val="22"/>
+              <w:lang w:val="es-CO" w:eastAsia="es-CO"/>
+              <w14:ligatures w14:val="standardContextual"/>
             </w:rPr>
           </w:pPr>
-          <w:hyperlink w:anchor="_Toc243748274" w:history="1">
+          <w:hyperlink w:anchor="_Toc243749648" w:history="1">
             <w:r>
               <w:rPr>
                 <w:rStyle w:val="Hipervnculo"/>
                 <w:rFonts w:ascii="Arial" w:hAnsi="Arial" w:cs="Arial"/>
                 <w:noProof/>
-                <w:color w:val="000000" w:themeColor="text1"/>
                 <w:sz w:val="22"/>
               </w:rPr>
               <w:t>Ejecución de la Aplicación</w:t>
@@ -915,7 +876,6 @@
                 <w:rFonts w:ascii="Arial" w:hAnsi="Arial" w:cs="Arial"/>
                 <w:noProof/>
                 <w:webHidden/>
-                <w:color w:val="000000" w:themeColor="text1"/>
                 <w:sz w:val="22"/>
               </w:rPr>
               <w:tab/>
@@ -925,7 +885,6 @@
                 <w:rFonts w:ascii="Arial" w:hAnsi="Arial" w:cs="Arial"/>
                 <w:noProof/>
                 <w:webHidden/>
-                <w:color w:val="000000" w:themeColor="text1"/>
                 <w:sz w:val="22"/>
               </w:rPr>
               <w:fldChar w:fldCharType="begin"/>
@@ -935,26 +894,23 @@
                 <w:rFonts w:ascii="Arial" w:hAnsi="Arial" w:cs="Arial"/>
                 <w:noProof/>
                 <w:webHidden/>
-                <w:color w:val="000000" w:themeColor="text1"/>
-                <w:sz w:val="22"/>
-              </w:rPr>
-              <w:instrText xml:space="preserve"> PAGEREF _Toc243748274 \h </w:instrText>
-            </w:r>
-            <w:r>
-              <w:rPr>
-                <w:rFonts w:ascii="Arial" w:hAnsi="Arial" w:cs="Arial"/>
-                <w:noProof/>
-                <w:webHidden/>
-                <w:color w:val="000000" w:themeColor="text1"/>
-                <w:sz w:val="22"/>
-              </w:rPr>
-            </w:r>
-            <w:r>
-              <w:rPr>
-                <w:rFonts w:ascii="Arial" w:hAnsi="Arial" w:cs="Arial"/>
-                <w:noProof/>
-                <w:webHidden/>
-                <w:color w:val="000000" w:themeColor="text1"/>
+                <w:sz w:val="22"/>
+              </w:rPr>
+              <w:instrText xml:space="preserve"> PAGEREF _Toc243749648 \h </w:instrText>
+            </w:r>
+            <w:r>
+              <w:rPr>
+                <w:rFonts w:ascii="Arial" w:hAnsi="Arial" w:cs="Arial"/>
+                <w:noProof/>
+                <w:webHidden/>
+                <w:sz w:val="22"/>
+              </w:rPr>
+            </w:r>
+            <w:r>
+              <w:rPr>
+                <w:rFonts w:ascii="Arial" w:hAnsi="Arial" w:cs="Arial"/>
+                <w:noProof/>
+                <w:webHidden/>
                 <w:sz w:val="22"/>
               </w:rPr>
               <w:fldChar w:fldCharType="separate"/>
@@ -964,7 +920,6 @@
                 <w:rFonts w:ascii="Arial" w:hAnsi="Arial" w:cs="Arial"/>
                 <w:noProof/>
                 <w:webHidden/>
-                <w:color w:val="000000" w:themeColor="text1"/>
                 <w:sz w:val="22"/>
               </w:rPr>
               <w:t>5</w:t>
@@ -974,7 +929,6 @@
                 <w:rFonts w:ascii="Arial" w:hAnsi="Arial" w:cs="Arial"/>
                 <w:noProof/>
                 <w:webHidden/>
-                <w:color w:val="000000" w:themeColor="text1"/>
                 <w:sz w:val="22"/>
               </w:rPr>
               <w:fldChar w:fldCharType="end"/>
@@ -991,27 +945,27 @@
             <w:rPr>
               <w:rFonts w:ascii="Arial" w:hAnsi="Arial" w:cs="Arial"/>
               <w:noProof/>
-              <w:color w:val="000000" w:themeColor="text1"/>
+              <w:kern w:val="2"/>
               <w:sz w:val="22"/>
+              <w:lang w:val="es-CO" w:eastAsia="es-CO"/>
+              <w14:ligatures w14:val="standardContextual"/>
             </w:rPr>
           </w:pPr>
-          <w:hyperlink w:anchor="_Toc243748275" w:history="1">
+          <w:hyperlink w:anchor="_Toc243749649" w:history="1">
             <w:r>
               <w:rPr>
                 <w:rStyle w:val="Hipervnculo"/>
                 <w:rFonts w:ascii="Arial" w:hAnsi="Arial" w:cs="Arial"/>
                 <w:noProof/>
-                <w:color w:val="000000" w:themeColor="text1"/>
-                <w:sz w:val="22"/>
-              </w:rPr>
-              <w:t>Nota sobre el desarrollo y la interfaz</w:t>
-            </w:r>
-            <w:r>
-              <w:rPr>
-                <w:rFonts w:ascii="Arial" w:hAnsi="Arial" w:cs="Arial"/>
-                <w:noProof/>
-                <w:webHidden/>
-                <w:color w:val="000000" w:themeColor="text1"/>
+                <w:sz w:val="22"/>
+              </w:rPr>
+              <w:t>Nota Sobre el Desarrollo y la Interfaz</w:t>
+            </w:r>
+            <w:r>
+              <w:rPr>
+                <w:rFonts w:ascii="Arial" w:hAnsi="Arial" w:cs="Arial"/>
+                <w:noProof/>
+                <w:webHidden/>
                 <w:sz w:val="22"/>
               </w:rPr>
               <w:tab/>
@@ -1021,7 +975,6 @@
                 <w:rFonts w:ascii="Arial" w:hAnsi="Arial" w:cs="Arial"/>
                 <w:noProof/>
                 <w:webHidden/>
-                <w:color w:val="000000" w:themeColor="text1"/>
                 <w:sz w:val="22"/>
               </w:rPr>
               <w:fldChar w:fldCharType="begin"/>
@@ -1031,26 +984,23 @@
                 <w:rFonts w:ascii="Arial" w:hAnsi="Arial" w:cs="Arial"/>
                 <w:noProof/>
                 <w:webHidden/>
-                <w:color w:val="000000" w:themeColor="text1"/>
-                <w:sz w:val="22"/>
-              </w:rPr>
-              <w:instrText xml:space="preserve"> PAGEREF _Toc243748275 \h </w:instrText>
-            </w:r>
-            <w:r>
-              <w:rPr>
-                <w:rFonts w:ascii="Arial" w:hAnsi="Arial" w:cs="Arial"/>
-                <w:noProof/>
-                <w:webHidden/>
-                <w:color w:val="000000" w:themeColor="text1"/>
-                <w:sz w:val="22"/>
-              </w:rPr>
-            </w:r>
-            <w:r>
-              <w:rPr>
-                <w:rFonts w:ascii="Arial" w:hAnsi="Arial" w:cs="Arial"/>
-                <w:noProof/>
-                <w:webHidden/>
-                <w:color w:val="000000" w:themeColor="text1"/>
+                <w:sz w:val="22"/>
+              </w:rPr>
+              <w:instrText xml:space="preserve"> PAGEREF _Toc243749649 \h </w:instrText>
+            </w:r>
+            <w:r>
+              <w:rPr>
+                <w:rFonts w:ascii="Arial" w:hAnsi="Arial" w:cs="Arial"/>
+                <w:noProof/>
+                <w:webHidden/>
+                <w:sz w:val="22"/>
+              </w:rPr>
+            </w:r>
+            <w:r>
+              <w:rPr>
+                <w:rFonts w:ascii="Arial" w:hAnsi="Arial" w:cs="Arial"/>
+                <w:noProof/>
+                <w:webHidden/>
                 <w:sz w:val="22"/>
               </w:rPr>
               <w:fldChar w:fldCharType="separate"/>
@@ -1060,7 +1010,6 @@
                 <w:rFonts w:ascii="Arial" w:hAnsi="Arial" w:cs="Arial"/>
                 <w:noProof/>
                 <w:webHidden/>
-                <w:color w:val="000000" w:themeColor="text1"/>
                 <w:sz w:val="22"/>
               </w:rPr>
               <w:t>6</w:t>
@@ -1070,7 +1019,6 @@
                 <w:rFonts w:ascii="Arial" w:hAnsi="Arial" w:cs="Arial"/>
                 <w:noProof/>
                 <w:webHidden/>
-                <w:color w:val="000000" w:themeColor="text1"/>
                 <w:sz w:val="22"/>
               </w:rPr>
               <w:fldChar w:fldCharType="end"/>
@@ -1087,17 +1035,18 @@
             <w:rPr>
               <w:rFonts w:ascii="Arial" w:hAnsi="Arial" w:cs="Arial"/>
               <w:noProof/>
-              <w:color w:val="000000" w:themeColor="text1"/>
+              <w:kern w:val="2"/>
               <w:sz w:val="22"/>
+              <w:lang w:val="es-CO" w:eastAsia="es-CO"/>
+              <w14:ligatures w14:val="standardContextual"/>
             </w:rPr>
           </w:pPr>
-          <w:hyperlink w:anchor="_Toc243748276" w:history="1">
+          <w:hyperlink w:anchor="_Toc243749650" w:history="1">
             <w:r>
               <w:rPr>
                 <w:rStyle w:val="Hipervnculo"/>
                 <w:rFonts w:ascii="Arial" w:hAnsi="Arial" w:cs="Arial"/>
                 <w:noProof/>
-                <w:color w:val="000000" w:themeColor="text1"/>
                 <w:sz w:val="22"/>
               </w:rPr>
               <w:t>Conclusión</w:t>
@@ -1107,7 +1056,6 @@
                 <w:rFonts w:ascii="Arial" w:hAnsi="Arial" w:cs="Arial"/>
                 <w:noProof/>
                 <w:webHidden/>
-                <w:color w:val="000000" w:themeColor="text1"/>
                 <w:sz w:val="22"/>
               </w:rPr>
               <w:tab/>
@@ -1117,7 +1065,6 @@
                 <w:rFonts w:ascii="Arial" w:hAnsi="Arial" w:cs="Arial"/>
                 <w:noProof/>
                 <w:webHidden/>
-                <w:color w:val="000000" w:themeColor="text1"/>
                 <w:sz w:val="22"/>
               </w:rPr>
               <w:fldChar w:fldCharType="begin"/>
@@ -1127,26 +1074,23 @@
                 <w:rFonts w:ascii="Arial" w:hAnsi="Arial" w:cs="Arial"/>
                 <w:noProof/>
                 <w:webHidden/>
-                <w:color w:val="000000" w:themeColor="text1"/>
-                <w:sz w:val="22"/>
-              </w:rPr>
-              <w:instrText xml:space="preserve"> PAGEREF _Toc243748276 \h </w:instrText>
-            </w:r>
-            <w:r>
-              <w:rPr>
-                <w:rFonts w:ascii="Arial" w:hAnsi="Arial" w:cs="Arial"/>
-                <w:noProof/>
-                <w:webHidden/>
-                <w:color w:val="000000" w:themeColor="text1"/>
-                <w:sz w:val="22"/>
-              </w:rPr>
-            </w:r>
-            <w:r>
-              <w:rPr>
-                <w:rFonts w:ascii="Arial" w:hAnsi="Arial" w:cs="Arial"/>
-                <w:noProof/>
-                <w:webHidden/>
-                <w:color w:val="000000" w:themeColor="text1"/>
+                <w:sz w:val="22"/>
+              </w:rPr>
+              <w:instrText xml:space="preserve"> PAGEREF _Toc243749650 \h </w:instrText>
+            </w:r>
+            <w:r>
+              <w:rPr>
+                <w:rFonts w:ascii="Arial" w:hAnsi="Arial" w:cs="Arial"/>
+                <w:noProof/>
+                <w:webHidden/>
+                <w:sz w:val="22"/>
+              </w:rPr>
+            </w:r>
+            <w:r>
+              <w:rPr>
+                <w:rFonts w:ascii="Arial" w:hAnsi="Arial" w:cs="Arial"/>
+                <w:noProof/>
+                <w:webHidden/>
                 <w:sz w:val="22"/>
               </w:rPr>
               <w:fldChar w:fldCharType="separate"/>
@@ -1156,7 +1100,6 @@
                 <w:rFonts w:ascii="Arial" w:hAnsi="Arial" w:cs="Arial"/>
                 <w:noProof/>
                 <w:webHidden/>
-                <w:color w:val="000000" w:themeColor="text1"/>
                 <w:sz w:val="22"/>
               </w:rPr>
               <w:t>6</w:t>
@@ -1166,7 +1109,96 @@
                 <w:rFonts w:ascii="Arial" w:hAnsi="Arial" w:cs="Arial"/>
                 <w:noProof/>
                 <w:webHidden/>
-                <w:color w:val="000000" w:themeColor="text1"/>
+                <w:sz w:val="22"/>
+              </w:rPr>
+              <w:fldChar w:fldCharType="end"/>
+            </w:r>
+          </w:hyperlink>
+        </w:p>
+        <w:p>
+          <w:pPr>
+            <w:pStyle w:val="TDC1"/>
+            <w:tabs>
+              <w:tab w:val="right" w:leader="dot" w:pos="9350"/>
+            </w:tabs>
+            <w:spacing w:line="480" w:lineRule="auto"/>
+            <w:rPr>
+              <w:rFonts w:ascii="Arial" w:hAnsi="Arial" w:cs="Arial"/>
+              <w:noProof/>
+              <w:kern w:val="2"/>
+              <w:sz w:val="22"/>
+              <w:lang w:val="es-CO" w:eastAsia="es-CO"/>
+              <w14:ligatures w14:val="standardContextual"/>
+            </w:rPr>
+          </w:pPr>
+          <w:hyperlink w:anchor="_Toc243749651" w:history="1">
+            <w:r>
+              <w:rPr>
+                <w:rStyle w:val="Hipervnculo"/>
+                <w:rFonts w:ascii="Arial" w:hAnsi="Arial" w:cs="Arial"/>
+                <w:noProof/>
+                <w:sz w:val="22"/>
+              </w:rPr>
+              <w:t>Link del Repositorio GitHub</w:t>
+            </w:r>
+            <w:r>
+              <w:rPr>
+                <w:rFonts w:ascii="Arial" w:hAnsi="Arial" w:cs="Arial"/>
+                <w:noProof/>
+                <w:webHidden/>
+                <w:sz w:val="22"/>
+              </w:rPr>
+              <w:tab/>
+            </w:r>
+            <w:r>
+              <w:rPr>
+                <w:rFonts w:ascii="Arial" w:hAnsi="Arial" w:cs="Arial"/>
+                <w:noProof/>
+                <w:webHidden/>
+                <w:sz w:val="22"/>
+              </w:rPr>
+              <w:fldChar w:fldCharType="begin"/>
+            </w:r>
+            <w:r>
+              <w:rPr>
+                <w:rFonts w:ascii="Arial" w:hAnsi="Arial" w:cs="Arial"/>
+                <w:noProof/>
+                <w:webHidden/>
+                <w:sz w:val="22"/>
+              </w:rPr>
+              <w:instrText xml:space="preserve"> PAGEREF _Toc243749651 \h </w:instrText>
+            </w:r>
+            <w:r>
+              <w:rPr>
+                <w:rFonts w:ascii="Arial" w:hAnsi="Arial" w:cs="Arial"/>
+                <w:noProof/>
+                <w:webHidden/>
+                <w:sz w:val="22"/>
+              </w:rPr>
+            </w:r>
+            <w:r>
+              <w:rPr>
+                <w:rFonts w:ascii="Arial" w:hAnsi="Arial" w:cs="Arial"/>
+                <w:noProof/>
+                <w:webHidden/>
+                <w:sz w:val="22"/>
+              </w:rPr>
+              <w:fldChar w:fldCharType="separate"/>
+            </w:r>
+            <w:r>
+              <w:rPr>
+                <w:rFonts w:ascii="Arial" w:hAnsi="Arial" w:cs="Arial"/>
+                <w:noProof/>
+                <w:webHidden/>
+                <w:sz w:val="22"/>
+              </w:rPr>
+              <w:t>7</w:t>
+            </w:r>
+            <w:r>
+              <w:rPr>
+                <w:rFonts w:ascii="Arial" w:hAnsi="Arial" w:cs="Arial"/>
+                <w:noProof/>
+                <w:webHidden/>
                 <w:sz w:val="22"/>
               </w:rPr>
               <w:fldChar w:fldCharType="end"/>
@@ -1203,7 +1235,7 @@
           <w:szCs w:val="22"/>
         </w:rPr>
       </w:pPr>
-      <w:bookmarkStart w:id="0" w:name="_Toc243748269"/>
+      <w:bookmarkStart w:id="0" w:name="_Toc243749643"/>
       <w:r>
         <w:rPr>
           <w:rFonts w:ascii="Arial" w:hAnsi="Arial" w:cs="Arial"/>
@@ -1313,7 +1345,17 @@
           <w:sz w:val="22"/>
           <w:lang w:val="es-CO" w:eastAsia="es-CO"/>
         </w:rPr>
-        <w:t>esarrollar una primera versión funcional de un sistema de información para el parqueadero Autos Colombia, que permita gestionar el registro de vehículos, controlar sus entradas y salidas, administrar la ocupación de las celdas y registrar las novedades que se presenten durante el servicio.</w:t>
+        <w:t xml:space="preserve">esarrollar una primera versión funcional de un sistema de información para el parqueadero Autos Colombia, que permita gestionar el registro </w:t>
+      </w:r>
+      <w:r>
+        <w:rPr>
+          <w:rFonts w:ascii="Arial" w:eastAsia="Times New Roman" w:hAnsi="Arial" w:cs="Arial"/>
+          <w:color w:val="000000" w:themeColor="text1"/>
+          <w:sz w:val="22"/>
+          <w:lang w:val="es-CO" w:eastAsia="es-CO"/>
+        </w:rPr>
+        <w:lastRenderedPageBreak/>
+        <w:t>de vehículos, controlar sus entradas y salidas, administrar la ocupación de las celdas y registrar las novedades que se presenten durante el servicio.</w:t>
       </w:r>
     </w:p>
     <w:p>
@@ -1328,7 +1370,7 @@
           <w:szCs w:val="22"/>
         </w:rPr>
       </w:pPr>
-      <w:bookmarkStart w:id="1" w:name="_Toc243748270"/>
+      <w:bookmarkStart w:id="1" w:name="_Toc243749644"/>
       <w:r>
         <w:rPr>
           <w:rFonts w:ascii="Arial" w:hAnsi="Arial" w:cs="Arial"/>
@@ -1336,7 +1378,6 @@
           <w:sz w:val="22"/>
           <w:szCs w:val="22"/>
         </w:rPr>
-        <w:lastRenderedPageBreak/>
         <w:t>Funcionalidades</w:t>
       </w:r>
       <w:bookmarkEnd w:id="1"/>
@@ -1537,7 +1578,7 @@
           <w:szCs w:val="22"/>
         </w:rPr>
       </w:pPr>
-      <w:bookmarkStart w:id="2" w:name="_Toc243748271"/>
+      <w:bookmarkStart w:id="2" w:name="_Toc243749645"/>
       <w:r>
         <w:rPr>
           <w:rFonts w:ascii="Arial" w:hAnsi="Arial" w:cs="Arial"/>
@@ -1670,6 +1711,7 @@
           <w:sz w:val="22"/>
           <w:lang w:val="es-CO" w:eastAsia="es-CO"/>
         </w:rPr>
+        <w:lastRenderedPageBreak/>
         <w:t>PostgreSQL: es el sistema gestor de bases de datos encargado de almacenar la información.</w:t>
       </w:r>
     </w:p>
@@ -1721,7 +1763,6 @@
           <w:sz w:val="22"/>
           <w:lang w:val="es-CO" w:eastAsia="es-CO"/>
         </w:rPr>
-        <w:lastRenderedPageBreak/>
         <w:t>Psycopg</w:t>
       </w:r>
       <w:proofErr w:type="spellEnd"/>
@@ -1798,25 +1839,7 @@
           <w:sz w:val="22"/>
           <w:lang w:val="es-CO" w:eastAsia="es-CO"/>
         </w:rPr>
-        <w:t xml:space="preserve">La combinación de estas tecnologías </w:t>
-      </w:r>
-      <w:r>
-        <w:rPr>
-          <w:rFonts w:ascii="Arial" w:eastAsia="Times New Roman" w:hAnsi="Arial" w:cs="Arial"/>
-          <w:color w:val="000000" w:themeColor="text1"/>
-          <w:sz w:val="22"/>
-          <w:lang w:val="es-CO" w:eastAsia="es-CO"/>
-        </w:rPr>
-        <w:t>me permitió</w:t>
-      </w:r>
-      <w:r>
-        <w:rPr>
-          <w:rFonts w:ascii="Arial" w:eastAsia="Times New Roman" w:hAnsi="Arial" w:cs="Arial"/>
-          <w:color w:val="000000" w:themeColor="text1"/>
-          <w:sz w:val="22"/>
-          <w:lang w:val="es-CO" w:eastAsia="es-CO"/>
-        </w:rPr>
-        <w:t xml:space="preserve"> conectar las funcionalidades de la aplicación con la información almacenada en la base de datos.</w:t>
+        <w:t>La combinación de estas tecnologías me permitió conectar las funcionalidades de la aplicación con la información almacenada en la base de datos.</w:t>
       </w:r>
     </w:p>
     <w:p>
@@ -1830,7 +1853,7 @@
           <w:szCs w:val="22"/>
         </w:rPr>
       </w:pPr>
-      <w:bookmarkStart w:id="3" w:name="_Toc243748272"/>
+      <w:bookmarkStart w:id="3" w:name="_Toc243749646"/>
       <w:r>
         <w:rPr>
           <w:rFonts w:ascii="Arial" w:hAnsi="Arial" w:cs="Arial"/>
@@ -2047,6 +2070,7 @@
           <w:sz w:val="22"/>
           <w:lang w:val="es-CO" w:eastAsia="es-CO"/>
         </w:rPr>
+        <w:lastRenderedPageBreak/>
         <w:t xml:space="preserve">El script SQL utilizado para crear la estructura de la base de datos se encuentra en la carpeta </w:t>
       </w:r>
       <w:proofErr w:type="spellStart"/>
@@ -2101,7 +2125,7 @@
           <w:szCs w:val="22"/>
         </w:rPr>
       </w:pPr>
-      <w:bookmarkStart w:id="4" w:name="_Toc243748273"/>
+      <w:bookmarkStart w:id="4" w:name="_Toc243749647"/>
       <w:r>
         <w:rPr>
           <w:rFonts w:ascii="Arial" w:hAnsi="Arial" w:cs="Arial"/>
@@ -2131,7 +2155,6 @@
           <w:sz w:val="22"/>
           <w:lang w:val="es-CO" w:eastAsia="es-CO"/>
         </w:rPr>
-        <w:lastRenderedPageBreak/>
         <w:t>Los archivos de</w:t>
       </w:r>
       <w:r>
@@ -2409,7 +2432,7 @@
           <w:szCs w:val="22"/>
         </w:rPr>
       </w:pPr>
-      <w:bookmarkStart w:id="5" w:name="_Toc243748274"/>
+      <w:bookmarkStart w:id="5" w:name="_Toc243749648"/>
       <w:r>
         <w:rPr>
           <w:rFonts w:ascii="Arial" w:hAnsi="Arial" w:cs="Arial"/>
@@ -2459,7 +2482,17 @@
           <w:sz w:val="22"/>
           <w:lang w:val="es-CO" w:eastAsia="es-CO"/>
         </w:rPr>
-        <w:t xml:space="preserve">. También es necesario configurar las credenciales de conexión mediante un archivo </w:t>
+        <w:t xml:space="preserve">. También es necesario configurar las credenciales de conexión mediante un </w:t>
+      </w:r>
+      <w:r>
+        <w:rPr>
+          <w:rFonts w:ascii="Arial" w:eastAsia="Times New Roman" w:hAnsi="Arial" w:cs="Arial"/>
+          <w:color w:val="000000" w:themeColor="text1"/>
+          <w:sz w:val="22"/>
+          <w:lang w:val="es-CO" w:eastAsia="es-CO"/>
+        </w:rPr>
+        <w:lastRenderedPageBreak/>
+        <w:t xml:space="preserve">archivo </w:t>
       </w:r>
       <w:proofErr w:type="gramStart"/>
       <w:r>
@@ -2535,7 +2568,6 @@
           <w:sz w:val="22"/>
           <w:lang w:val="es-CO" w:eastAsia="es-CO"/>
         </w:rPr>
-        <w:lastRenderedPageBreak/>
         <w:t xml:space="preserve">Instalar las dependencias del proyecto mediante el comando </w:t>
       </w:r>
       <w:proofErr w:type="spellStart"/>
@@ -2753,7 +2785,7 @@
           <w:szCs w:val="22"/>
         </w:rPr>
       </w:pPr>
-      <w:bookmarkStart w:id="6" w:name="_Toc243748275"/>
+      <w:bookmarkStart w:id="6" w:name="_Toc243749649"/>
       <w:r>
         <w:rPr>
           <w:rFonts w:ascii="Arial" w:hAnsi="Arial" w:cs="Arial"/>
@@ -2915,7 +2947,7 @@
           <w:szCs w:val="22"/>
         </w:rPr>
       </w:pPr>
-      <w:bookmarkStart w:id="7" w:name="_Toc243748276"/>
+      <w:bookmarkStart w:id="7" w:name="_Toc243749650"/>
       <w:r>
         <w:rPr>
           <w:rFonts w:ascii="Arial" w:hAnsi="Arial" w:cs="Arial"/>
@@ -2945,6 +2977,7 @@
           <w:sz w:val="22"/>
           <w:lang w:val="es-CO" w:eastAsia="es-CO"/>
         </w:rPr>
+        <w:lastRenderedPageBreak/>
         <w:t>El desarrollo de esta primera versión permitió construir un sistema de información que reúne las principales operaciones del parqueadero Autos Colombia. La aplicación permite registrar vehículos, gestionar sus entradas y salidas, controlar la asignación de celdas, registrar novedades y consultar el historial de movimientos.</w:t>
       </w:r>
     </w:p>
@@ -2966,7 +2999,6 @@
           <w:sz w:val="22"/>
           <w:lang w:val="es-CO" w:eastAsia="es-CO"/>
         </w:rPr>
-        <w:lastRenderedPageBreak/>
         <w:t xml:space="preserve">Además del desarrollo de las funcionalidades, </w:t>
       </w:r>
       <w:r>
@@ -2990,8 +3022,94 @@
     </w:p>
     <w:p>
       <w:pPr>
+        <w:pStyle w:val="Ttulo1"/>
         <w:spacing w:line="480" w:lineRule="auto"/>
         <w:jc w:val="center"/>
+        <w:rPr>
+          <w:rFonts w:ascii="Arial" w:hAnsi="Arial" w:cs="Arial"/>
+          <w:sz w:val="22"/>
+          <w:szCs w:val="22"/>
+        </w:rPr>
+      </w:pPr>
+      <w:bookmarkStart w:id="8" w:name="_Toc243749651"/>
+      <w:r>
+        <w:rPr>
+          <w:rFonts w:ascii="Arial" w:hAnsi="Arial" w:cs="Arial"/>
+          <w:sz w:val="22"/>
+          <w:szCs w:val="22"/>
+        </w:rPr>
+        <w:t>Link del Repositorio GitHub</w:t>
+      </w:r>
+      <w:bookmarkEnd w:id="8"/>
+    </w:p>
+    <w:p>
+      <w:pPr>
+        <w:rPr>
+          <w:rFonts w:eastAsia="Times New Roman"/>
+          <w:lang w:val="es-CO"/>
+        </w:rPr>
+      </w:pPr>
+      <w:hyperlink r:id="rId7" w:history="1">
+        <w:r>
+          <w:rPr>
+            <w:rStyle w:val="Hipervnculo"/>
+            <w:rFonts w:ascii="Arial" w:hAnsi="Arial" w:cs="Arial"/>
+            <w:sz w:val="22"/>
+            <w:lang w:val="es-CO"/>
+          </w:rPr>
+          <w:t>https://github.com/mtz12-02/Tangarife_Manu</w:t>
+        </w:r>
+        <w:r>
+          <w:rPr>
+            <w:rStyle w:val="Hipervnculo"/>
+            <w:rFonts w:ascii="Arial" w:hAnsi="Arial" w:cs="Arial"/>
+            <w:sz w:val="22"/>
+            <w:lang w:val="es-CO"/>
+          </w:rPr>
+          <w:t>e</w:t>
+        </w:r>
+        <w:r>
+          <w:rPr>
+            <w:rStyle w:val="Hipervnculo"/>
+            <w:rFonts w:ascii="Arial" w:hAnsi="Arial" w:cs="Arial"/>
+            <w:sz w:val="22"/>
+            <w:lang w:val="es-CO"/>
+          </w:rPr>
+          <w:t>la_EA1</w:t>
+        </w:r>
+      </w:hyperlink>
+      <w:r>
+        <w:rPr>
+          <w:rFonts w:ascii="Arial" w:hAnsi="Arial" w:cs="Arial"/>
+          <w:sz w:val="22"/>
+          <w:lang w:val="es-CO"/>
+        </w:rPr>
+        <w:t xml:space="preserve"> </w:t>
+      </w:r>
+      <w:r>
+        <w:rPr>
+          <w:rFonts w:ascii="Arial" w:hAnsi="Arial" w:cs="Arial"/>
+          <w:sz w:val="22"/>
+          <w:lang w:val="es-CO"/>
+        </w:rPr>
+        <w:t xml:space="preserve"> </w:t>
+      </w:r>
+    </w:p>
+    <w:p>
+      <w:pPr>
+        <w:spacing w:line="480" w:lineRule="auto"/>
+        <w:jc w:val="center"/>
+        <w:rPr>
+          <w:rFonts w:ascii="Arial" w:hAnsi="Arial" w:cs="Arial"/>
+          <w:color w:val="000000" w:themeColor="text1"/>
+          <w:sz w:val="22"/>
+          <w:lang w:val="es-CO"/>
+        </w:rPr>
+      </w:pPr>
+    </w:p>
+    <w:p>
+      <w:pPr>
+        <w:spacing w:line="480" w:lineRule="auto"/>
         <w:rPr>
           <w:rFonts w:ascii="Arial" w:hAnsi="Arial" w:cs="Arial"/>
           <w:color w:val="000000" w:themeColor="text1"/>
@@ -4699,6 +4817,18 @@
       <w:shd w:val="clear" w:color="auto" w:fill="E1DFDD"/>
     </w:rPr>
   </w:style>
+  <w:style w:type="character" w:styleId="Hipervnculovisitado">
+    <w:name w:val="FollowedHyperlink"/>
+    <w:basedOn w:val="Fuentedeprrafopredeter"/>
+    <w:uiPriority w:val="99"/>
+    <w:semiHidden/>
+    <w:unhideWhenUsed/>
+    <w:rsid w:val="008B14A5"/>
+    <w:rPr>
+      <w:color w:val="954F72" w:themeColor="followedHyperlink"/>
+      <w:u w:val="single"/>
+    </w:rPr>
+  </w:style>
 </w:styles>
 </file>
 

</xml_diff>